<commit_message>
feat: replace placeholder templates with real anonymized legal documents
Replaced all 8 files in public/downloads/ (4 DOCX + 4 PDF) with proper
anonymized templates built from real client cases. All personal data
(names, IINs, phone numbers, addresses, contract numbers, amounts) removed
and replaced with [placeholder] fields. Full legal text and article
references preserved.

Co-Authored-By: Claude Sonnet 4.6 <noreply@anthropic.com>
</commit_message>
<xml_diff>
--- a/public/downloads/obrazec-vozrazheniya-na-ispolnitelnuyu-nadpis.docx
+++ b/public/downloads/obrazec-vozrazheniya-na-ispolnitelnuyu-nadpis.docx
@@ -4,518 +4,471 @@
   <w:body>
     <w:p>
       <w:pPr>
-        <w:pStyle w:val="Title"/>
-        <w:jc w:val="center"/>
+        <w:spacing w:before="0" w:after="40"/>
+        <w:ind w:firstLine="0"/>
+        <w:jc w:val="right"/>
       </w:pPr>
       <w:r>
         <w:rPr>
+          <w:rFonts w:ascii="Times New Roman" w:hAnsi="Times New Roman"/>
           <w:b/>
+          <w:sz w:val="24"/>
         </w:rPr>
-        <w:t>ВОЗРАЖЕНИЕ</w:t>
-        <w:br/>
-        <w:t>против заявленного требования по исполнительной надписи нотариуса</w:t>
+        <w:t>Нотариусу [наименование области/города]</w:t>
       </w:r>
     </w:p>
     <w:p>
       <w:pPr>
+        <w:spacing w:before="0" w:after="40"/>
+        <w:ind w:firstLine="0"/>
+        <w:jc w:val="right"/>
+      </w:pPr>
+      <w:r>
+        <w:rPr>
+          <w:rFonts w:ascii="Times New Roman" w:hAnsi="Times New Roman"/>
+          <w:b/>
+          <w:sz w:val="24"/>
+        </w:rPr>
+        <w:t>[ФИО НОТАРИУСА ЗАГЛАВНЫМИ БУКВАМИ]</w:t>
+      </w:r>
+    </w:p>
+    <w:p>
+      <w:pPr>
+        <w:spacing w:before="0" w:after="40"/>
+        <w:ind w:firstLine="0"/>
         <w:jc w:val="right"/>
       </w:pPr>
       <w:r>
         <w:rPr>
           <w:rFonts w:ascii="Times New Roman" w:hAnsi="Times New Roman"/>
           <w:b w:val="0"/>
-          <w:sz w:val="22"/>
+          <w:sz w:val="24"/>
         </w:rPr>
-        <w:t>Нотариусу: [ФИО нотариуса, нотариальный округ, адрес]</w:t>
+        <w:t>Лицензия [№_____ от дд.мм.гггг]</w:t>
       </w:r>
     </w:p>
     <w:p>
       <w:pPr>
+        <w:spacing w:before="0" w:after="40"/>
+        <w:ind w:firstLine="0"/>
         <w:jc w:val="right"/>
       </w:pPr>
       <w:r>
         <w:rPr>
           <w:rFonts w:ascii="Times New Roman" w:hAnsi="Times New Roman"/>
           <w:b w:val="0"/>
-          <w:sz w:val="22"/>
+          <w:sz w:val="24"/>
         </w:rPr>
-        <w:t>От должника: [ФИО полностью, ИИН]</w:t>
       </w:r>
     </w:p>
     <w:p>
       <w:pPr>
+        <w:spacing w:before="0" w:after="40"/>
+        <w:ind w:firstLine="0"/>
         <w:jc w:val="right"/>
       </w:pPr>
       <w:r>
         <w:rPr>
           <w:rFonts w:ascii="Times New Roman" w:hAnsi="Times New Roman"/>
           <w:b w:val="0"/>
-          <w:sz w:val="22"/>
+          <w:sz w:val="24"/>
         </w:rPr>
-        <w:t>Адрес: [адрес], телефон: [номер], e-mail: [почта]</w:t>
+        <w:t>от: [ФИО ДОЛЖНИКА ЗАГЛАВНЫМИ БУКВАМИ]</w:t>
       </w:r>
     </w:p>
     <w:p>
+      <w:pPr>
+        <w:spacing w:before="0" w:after="40"/>
+        <w:ind w:firstLine="0"/>
+        <w:jc w:val="right"/>
+      </w:pPr>
       <w:r>
         <w:rPr>
           <w:rFonts w:ascii="Times New Roman" w:hAnsi="Times New Roman"/>
           <w:b w:val="0"/>
-          <w:sz w:val="22"/>
+          <w:sz w:val="24"/>
         </w:rPr>
+        <w:t>[дата рождения] г.р., ИИН [000000000000]</w:t>
       </w:r>
     </w:p>
-    <w:tbl>
-      <w:tblPr>
-        <w:tblW w:type="auto" w:w="0"/>
-        <w:jc w:val="center"/>
-        <w:tblLook w:firstColumn="1" w:firstRow="1" w:lastColumn="0" w:lastRow="0" w:noHBand="0" w:noVBand="1" w:val="04A0"/>
-        <w:tblBorders>
-          <w:top w:val="single" w:sz="4" w:space="0" w:color="BFBFBF"/>
-          <w:left w:val="single" w:sz="4" w:space="0" w:color="BFBFBF"/>
-          <w:bottom w:val="single" w:sz="4" w:space="0" w:color="BFBFBF"/>
-          <w:right w:val="single" w:sz="4" w:space="0" w:color="BFBFBF"/>
-          <w:insideH w:val="single" w:sz="4" w:space="0" w:color="BFBFBF"/>
-          <w:insideV w:val="single" w:sz="4" w:space="0" w:color="BFBFBF"/>
-        </w:tblBorders>
-      </w:tblPr>
-      <w:tblGrid>
-        <w:gridCol w:w="10256"/>
-      </w:tblGrid>
-      <w:tr>
-        <w:tc>
-          <w:tcPr>
-            <w:tcW w:type="dxa" w:w="10256"/>
-            <w:vAlign w:val="center"/>
-            <w:shd w:fill="F2F2F2"/>
-          </w:tcPr>
-          <w:p>
-            <w:r>
-              <w:rPr>
-                <w:rFonts w:ascii="Times New Roman" w:hAnsi="Times New Roman"/>
-                <w:b/>
-                <w:sz w:val="20"/>
-              </w:rPr>
-              <w:t xml:space="preserve">Срок: </w:t>
-            </w:r>
-            <w:r>
-              <w:rPr>
-                <w:rFonts w:ascii="Times New Roman" w:hAnsi="Times New Roman"/>
-                <w:sz w:val="20"/>
-              </w:rPr>
-              <w:t>Возражение направляется нотариусу, совершившему исполнительную надпись. Сохраните доказательство отправки: почтовую квитанцию, e-mail, скрин личного кабинета/ЕНПФ/ЕНП, входящий номер.</w:t>
-            </w:r>
-          </w:p>
-        </w:tc>
-      </w:tr>
-    </w:tbl>
     <w:p>
+      <w:pPr>
+        <w:spacing w:before="0" w:after="40"/>
+        <w:ind w:firstLine="0"/>
+        <w:jc w:val="right"/>
+      </w:pPr>
       <w:r>
         <w:rPr>
           <w:rFonts w:ascii="Times New Roman" w:hAnsi="Times New Roman"/>
           <w:b w:val="0"/>
-          <w:sz w:val="22"/>
+          <w:sz w:val="24"/>
         </w:rPr>
+        <w:t>адрес: Республика Казахстан, [область], [район],</w:t>
       </w:r>
     </w:p>
     <w:p>
+      <w:pPr>
+        <w:spacing w:before="0" w:after="40"/>
+        <w:ind w:firstLine="0"/>
+        <w:jc w:val="right"/>
+      </w:pPr>
       <w:r>
         <w:rPr>
           <w:rFonts w:ascii="Times New Roman" w:hAnsi="Times New Roman"/>
           <w:b w:val="0"/>
-          <w:sz w:val="22"/>
+          <w:sz w:val="24"/>
         </w:rPr>
-        <w:t>Мне стало известно о совершении исполнительной надписи нотариуса № [номер] от [дата], совершенной нотариусом [ФИО нотариуса], о взыскании с меня в пользу [наименование взыскателя] суммы [сумма] тенге.</w:t>
+        <w:t>[населённый пункт], ул. [название], [дом]</w:t>
       </w:r>
     </w:p>
     <w:p>
+      <w:pPr>
+        <w:spacing w:before="0" w:after="40"/>
+        <w:ind w:firstLine="0"/>
+        <w:jc w:val="right"/>
+      </w:pPr>
       <w:r>
         <w:rPr>
           <w:rFonts w:ascii="Times New Roman" w:hAnsi="Times New Roman"/>
           <w:b w:val="0"/>
-          <w:sz w:val="22"/>
+          <w:sz w:val="24"/>
         </w:rPr>
-        <w:t>С заявленным требованием не согласен/не согласна, так как оно является спорным. Настоящим заявляю возражения против требования взыскателя и прошу отменить исполнительную надпись.</w:t>
+        <w:t>тел.: [+7 ___ ___ __ __]</w:t>
       </w:r>
     </w:p>
     <w:p>
+      <w:pPr>
+        <w:spacing w:before="240" w:after="120"/>
+        <w:ind w:firstLine="0"/>
+        <w:jc w:val="center"/>
+      </w:pPr>
       <w:r>
         <w:rPr>
           <w:rFonts w:ascii="Times New Roman" w:hAnsi="Times New Roman"/>
           <w:b/>
-          <w:sz w:val="22"/>
+          <w:sz w:val="28"/>
         </w:rPr>
-        <w:t>Основания возражений:</w:t>
+        <w:t>ВОЗРАЖЕНИЯ</w:t>
       </w:r>
     </w:p>
     <w:p>
       <w:pPr>
-        <w:pStyle w:val="ListBullet"/>
+        <w:spacing w:before="40" w:after="120"/>
+        <w:ind w:firstLine="0"/>
+        <w:jc w:val="center"/>
       </w:pPr>
       <w:r>
         <w:rPr>
           <w:rFonts w:ascii="Times New Roman" w:hAnsi="Times New Roman"/>
-          <w:sz w:val="22"/>
+          <w:b/>
+          <w:sz w:val="24"/>
         </w:rPr>
-        <w:t>Я не признаю сумму задолженности в заявленном размере; расчет взыскателя мне не понятен/не предоставлен.</w:t>
+        <w:t>(на исполнительную надпись)</w:t>
       </w:r>
     </w:p>
     <w:p>
       <w:pPr>
-        <w:pStyle w:val="ListBullet"/>
+        <w:spacing w:before="0" w:after="120"/>
+        <w:ind w:firstLine="709"/>
+        <w:jc w:val="both"/>
       </w:pPr>
       <w:r>
         <w:rPr>
           <w:rFonts w:ascii="Times New Roman" w:hAnsi="Times New Roman"/>
-          <w:sz w:val="22"/>
+          <w:b w:val="0"/>
+          <w:sz w:val="24"/>
         </w:rPr>
-        <w:t>Мне не была надлежащим образом вручена копия исполнительной надписи и/или уведомление о необходимости исполнения требования.</w:t>
+        <w:t>«[число]» [месяц] [год] года Вами, нотариусом [наименование области/города], была совершена исполнительная надпись, уникальный номер [XXXXXXX-XXXXXX/XXX], зарегистрированная в реестре за №[XXXX], о взыскании с должника [ФИО ДОЛЖНИКА], [дата рождения] г.р., ИИН [ИИН], в пользу взыскателя [наименование взыскателя], БИН [БИН взыскателя], суммы задолженности в размере [СУММА ДОЛГА] тенге и расходов по совершению исполнительной надписи в размере [РАСХОДЫ] тенге. Общая сумма, подлежащая взысканию, составляет [ИТОГО] тенге.</w:t>
       </w:r>
     </w:p>
     <w:p>
       <w:pPr>
-        <w:pStyle w:val="ListBullet"/>
+        <w:spacing w:before="0" w:after="120"/>
+        <w:ind w:firstLine="709"/>
+        <w:jc w:val="both"/>
       </w:pPr>
       <w:r>
         <w:rPr>
           <w:rFonts w:ascii="Times New Roman" w:hAnsi="Times New Roman"/>
-          <w:sz w:val="22"/>
+          <w:b w:val="0"/>
+          <w:sz w:val="24"/>
         </w:rPr>
-        <w:t>Сроки, суммы, проценты, штрафы, комиссии либо основание взыскания подлежат проверке в судебном порядке.</w:t>
+        <w:t>Считаю, что указанная исполнительная надпись подлежит отмене по следующим основаниям.</w:t>
       </w:r>
     </w:p>
     <w:p>
       <w:pPr>
-        <w:pStyle w:val="ListBullet"/>
+        <w:spacing w:before="0" w:after="120"/>
+        <w:ind w:firstLine="709"/>
+        <w:jc w:val="both"/>
       </w:pPr>
       <w:r>
         <w:rPr>
           <w:rFonts w:ascii="Times New Roman" w:hAnsi="Times New Roman"/>
-          <w:sz w:val="22"/>
+          <w:b w:val="0"/>
+          <w:sz w:val="24"/>
         </w:rPr>
-        <w:t>Между мной и взыскателем имеется спор о праве/размере задолженности/сроках исполнения обязательства.</w:t>
+        <w:t>Согласно статье 92-2 Закона Республики Казахстан «О нотариате» исполнительная надпись совершается, если представленные документы подтверждают бесспорность задолженности или иной ответственности должника перед взыскателем, а также если со дня возникновения права на иск прошло не более трёх лет. Однако я не согласен(а) с заявленной суммой задолженности, не признаю её бесспорной и считаю требование взыскателя спорным.</w:t>
       </w:r>
     </w:p>
     <w:p>
       <w:pPr>
-        <w:pStyle w:val="ListBullet"/>
+        <w:spacing w:before="0" w:after="120"/>
+        <w:ind w:firstLine="709"/>
+        <w:jc w:val="both"/>
       </w:pPr>
       <w:r>
         <w:rPr>
           <w:rFonts w:ascii="Times New Roman" w:hAnsi="Times New Roman"/>
-          <w:sz w:val="22"/>
+          <w:b w:val="0"/>
+          <w:sz w:val="24"/>
         </w:rPr>
-        <w:t>Иные обстоятельства: [указать конкретно: оплата производилась, договор не подписывался, истек срок, неверный ИИН, не тот должник, задолженность погашена частично/полностью и т.д.].</w:t>
+        <w:t>Согласно подпункту 2 пункта 223 Правил совершения нотариальных действий нотариусами, утверждённых приказом Министра юстиции Республики Казахстан от 31 января 2012 года №31, исполнительная надпись совершается при предоставлении документов, подтверждающих письменное признание должником суммы задолженности, пени либо иной ответственности. Такими документами могут являться акт сверки расчётов, подписанный взыскателем и должником, ответ на претензию, в котором должник признаёт обязательство, акцептованное платёжное требование или иной документ, оформленный в соответствии с требованиями законодательства.</w:t>
       </w:r>
     </w:p>
     <w:p>
+      <w:pPr>
+        <w:spacing w:before="0" w:after="120"/>
+        <w:ind w:firstLine="709"/>
+        <w:jc w:val="both"/>
+      </w:pPr>
+      <w:r>
+        <w:rPr>
+          <w:rFonts w:ascii="Times New Roman" w:hAnsi="Times New Roman"/>
+          <w:b w:val="0"/>
+          <w:sz w:val="24"/>
+        </w:rPr>
+        <w:t>Однако я не предоставлял(а) взыскателю и нотариусу документы, подтверждающие письменное признание указанной суммы задолженности. Акт сверки расчётов мной не подписывался, ответ о признании долга не направлялся, сумма задолженности мной не признавалась.</w:t>
+      </w:r>
+    </w:p>
+    <w:p>
+      <w:pPr>
+        <w:spacing w:before="0" w:after="120"/>
+        <w:ind w:firstLine="709"/>
+        <w:jc w:val="both"/>
+      </w:pPr>
+      <w:r>
+        <w:rPr>
+          <w:rFonts w:ascii="Times New Roman" w:hAnsi="Times New Roman"/>
+          <w:b w:val="0"/>
+          <w:sz w:val="24"/>
+        </w:rPr>
+        <w:t>В исполнительной надписи указано, что взыскание производится в пользу [наименование взыскателя]. При этом мной не признавалась задолженность перед указанным взыскателем в заявленном размере, а также не подтверждалась бесспорность требования.</w:t>
+      </w:r>
+    </w:p>
+    <w:p>
+      <w:pPr>
+        <w:spacing w:before="0" w:after="120"/>
+        <w:ind w:firstLine="709"/>
+        <w:jc w:val="both"/>
+      </w:pPr>
+      <w:r>
+        <w:rPr>
+          <w:rFonts w:ascii="Times New Roman" w:hAnsi="Times New Roman"/>
+          <w:b w:val="0"/>
+          <w:sz w:val="24"/>
+        </w:rPr>
+        <w:t>Согласно статье 92-6 Закона Республики Казахстан «О нотариате» после совершения исполнительной надписи нотариус не позднее следующего рабочего дня направляет её копию должнику с уведомлением о вручении. Однако копию исполнительной надписи надлежащим образом я не получал(а), о совершении исполнительной надписи своевременно уведомлен(а) не был(а).</w:t>
+      </w:r>
+    </w:p>
+    <w:p>
+      <w:pPr>
+        <w:spacing w:before="0" w:after="120"/>
+        <w:ind w:firstLine="709"/>
+        <w:jc w:val="both"/>
+      </w:pPr>
+      <w:r>
+        <w:rPr>
+          <w:rFonts w:ascii="Times New Roman" w:hAnsi="Times New Roman"/>
+          <w:b w:val="0"/>
+          <w:sz w:val="24"/>
+        </w:rPr>
+        <w:t>Копию исполнительной надписи я получил(а) только после того, как узнал(а) о наличии исполнительного производства и/или ограничений. В связи с этим считаю, что срок подачи возражения не пропущен, поскольку десятидневный срок должен исчисляться со дня фактического получения копии исполнительной надписи.</w:t>
+      </w:r>
+    </w:p>
+    <w:p>
+      <w:pPr>
+        <w:spacing w:before="0" w:after="120"/>
+        <w:ind w:firstLine="709"/>
+        <w:jc w:val="both"/>
+      </w:pPr>
+      <w:r>
+        <w:rPr>
+          <w:rFonts w:ascii="Times New Roman" w:hAnsi="Times New Roman"/>
+          <w:b w:val="0"/>
+          <w:sz w:val="24"/>
+        </w:rPr>
+        <w:t>Согласно статье 92-8 Закона Республики Казахстан «О нотариате» нотариус выносит постановление об отмене исполнительной надписи не позднее трёх рабочих дней со дня поступления возражения. Копии постановления об отмене исполнительной надписи направляются взыскателю и должнику не позднее следующего рабочего дня после его вынесения.</w:t>
+      </w:r>
+    </w:p>
+    <w:p>
+      <w:pPr>
+        <w:spacing w:before="0" w:after="80"/>
+        <w:ind w:firstLine="709"/>
+        <w:jc w:val="both"/>
+      </w:pPr>
+      <w:r>
+        <w:rPr>
+          <w:rFonts w:ascii="Times New Roman" w:hAnsi="Times New Roman"/>
+          <w:b w:val="0"/>
+          <w:sz w:val="24"/>
+        </w:rPr>
+        <w:t>На основании вышеизложенного, прошу Вас:</w:t>
+      </w:r>
+    </w:p>
+    <w:p>
+      <w:pPr>
+        <w:spacing w:before="0" w:after="80"/>
+        <w:ind w:firstLine="0" w:left="0"/>
+        <w:jc w:val="both"/>
+      </w:pPr>
+      <w:r>
+        <w:rPr>
+          <w:rFonts w:ascii="Times New Roman" w:hAnsi="Times New Roman"/>
+          <w:sz w:val="24"/>
+        </w:rPr>
+        <w:t>1. Отменить исполнительную надпись, уникальный номер [XXXXXXX-XXXXXX/XXX], зарегистрированную в реестре за №[XXXX], совершённую «[число]» [месяц] [год] года нотариусом [ФИО нотариуса], о взыскании с [ФИО ДОЛЖНИКА], [дата рождения] г.р., ИИН [ИИН], в пользу [наименование взыскателя], БИН [БИН], общей суммы [ИТОГО] тенге.</w:t>
+      </w:r>
+    </w:p>
+    <w:p>
+      <w:pPr>
+        <w:spacing w:before="0" w:after="80"/>
+        <w:ind w:firstLine="0" w:left="0"/>
+        <w:jc w:val="both"/>
+      </w:pPr>
+      <w:r>
+        <w:rPr>
+          <w:rFonts w:ascii="Times New Roman" w:hAnsi="Times New Roman"/>
+          <w:sz w:val="24"/>
+        </w:rPr>
+        <w:t>2. Направить постановление об отмене исполнительной надписи должнику по номеру телефона/WhatsApp: [+7 ___ ___ __ __].</w:t>
+      </w:r>
+    </w:p>
+    <w:p>
+      <w:pPr>
+        <w:spacing w:before="0" w:after="80"/>
+        <w:ind w:firstLine="0" w:left="0"/>
+        <w:jc w:val="both"/>
+      </w:pPr>
+      <w:r>
+        <w:rPr>
+          <w:rFonts w:ascii="Times New Roman" w:hAnsi="Times New Roman"/>
+          <w:sz w:val="24"/>
+        </w:rPr>
+        <w:t>3. Уведомить взыскателя и судебного исполнителя об отмене исполнительной надписи.</w:t>
+      </w:r>
+    </w:p>
+    <w:p>
+      <w:pPr>
+        <w:spacing w:before="160" w:after="40"/>
+        <w:ind w:firstLine="0"/>
+        <w:jc w:val="both"/>
+      </w:pPr>
       <w:r>
         <w:rPr>
           <w:rFonts w:ascii="Times New Roman" w:hAnsi="Times New Roman"/>
           <w:b/>
-          <w:sz w:val="22"/>
-        </w:rPr>
-        <w:t>Прошу:</w:t>
-      </w:r>
-    </w:p>
-    <w:p>
-      <w:pPr>
-        <w:pStyle w:val="ListNumber"/>
-      </w:pPr>
-      <w:r>
-        <w:rPr>
-          <w:rFonts w:ascii="Times New Roman" w:hAnsi="Times New Roman"/>
-          <w:sz w:val="22"/>
-        </w:rPr>
-        <w:t>Принять и зарегистрировать настоящее возражение.</w:t>
-      </w:r>
-    </w:p>
-    <w:p>
-      <w:pPr>
-        <w:pStyle w:val="ListNumber"/>
-      </w:pPr>
-      <w:r>
-        <w:rPr>
-          <w:rFonts w:ascii="Times New Roman" w:hAnsi="Times New Roman"/>
-          <w:sz w:val="22"/>
-        </w:rPr>
-        <w:t>Вынести постановление об отмене исполнительной надписи № [номер] от [дата].</w:t>
-      </w:r>
-    </w:p>
-    <w:p>
-      <w:pPr>
-        <w:pStyle w:val="ListNumber"/>
-      </w:pPr>
-      <w:r>
-        <w:rPr>
-          <w:rFonts w:ascii="Times New Roman" w:hAnsi="Times New Roman"/>
-          <w:sz w:val="22"/>
-        </w:rPr>
-        <w:t>Направить мне копию постановления об отмене исполнительной надписи способом: [e-mail / WhatsApp / почта / лично].</w:t>
-      </w:r>
-    </w:p>
-    <w:p>
-      <w:pPr>
-        <w:pStyle w:val="ListNumber"/>
-      </w:pPr>
-      <w:r>
-        <w:rPr>
-          <w:rFonts w:ascii="Times New Roman" w:hAnsi="Times New Roman"/>
-          <w:sz w:val="22"/>
-        </w:rPr>
-        <w:t>При наличии исполнительного производства направить постановление частному судебному исполнителю [ФИО ЧСИ, номер ИП] либо выдать мне копию для самостоятельного направления.</w:t>
-      </w:r>
-    </w:p>
-    <w:p>
-      <w:r>
-        <w:rPr>
-          <w:rFonts w:ascii="Times New Roman" w:hAnsi="Times New Roman"/>
-          <w:b/>
-          <w:sz w:val="22"/>
+          <w:sz w:val="24"/>
         </w:rPr>
         <w:t>Приложения:</w:t>
       </w:r>
     </w:p>
     <w:p>
       <w:pPr>
-        <w:pStyle w:val="ListBullet"/>
+        <w:spacing w:before="0" w:after="40"/>
+        <w:ind w:firstLine="0"/>
+        <w:jc w:val="both"/>
       </w:pPr>
       <w:r>
         <w:rPr>
           <w:rFonts w:ascii="Times New Roman" w:hAnsi="Times New Roman"/>
-          <w:sz w:val="22"/>
+          <w:b w:val="0"/>
+          <w:sz w:val="24"/>
         </w:rPr>
-        <w:t>Копия удостоверения личности.</w:t>
+        <w:t>1. Копия исполнительной надписи.</w:t>
       </w:r>
     </w:p>
     <w:p>
       <w:pPr>
-        <w:pStyle w:val="ListBullet"/>
+        <w:spacing w:before="0" w:after="40"/>
+        <w:ind w:firstLine="0"/>
+        <w:jc w:val="both"/>
       </w:pPr>
       <w:r>
         <w:rPr>
           <w:rFonts w:ascii="Times New Roman" w:hAnsi="Times New Roman"/>
-          <w:sz w:val="22"/>
+          <w:b w:val="0"/>
+          <w:sz w:val="24"/>
         </w:rPr>
-        <w:t>Копия исполнительной надписи/постановления ЧСИ/уведомления о взыскании - при наличии.</w:t>
+        <w:t>2. Копия удостоверения личности.</w:t>
       </w:r>
     </w:p>
     <w:p>
       <w:pPr>
-        <w:pStyle w:val="ListBullet"/>
+        <w:spacing w:before="0" w:after="240"/>
+        <w:ind w:firstLine="0"/>
+        <w:jc w:val="both"/>
       </w:pPr>
       <w:r>
         <w:rPr>
           <w:rFonts w:ascii="Times New Roman" w:hAnsi="Times New Roman"/>
-          <w:sz w:val="22"/>
+          <w:b w:val="0"/>
+          <w:sz w:val="24"/>
         </w:rPr>
-        <w:t>Доказательства даты, когда стало известно об исполнительной надписи: скрин АИС ОИП, уведомление банка, постановление ЧСИ, почтовое уведомление, иное.</w:t>
+        <w:t>3. Иные документы при наличии.</w:t>
       </w:r>
     </w:p>
     <w:p>
       <w:pPr>
-        <w:pStyle w:val="ListBullet"/>
+        <w:spacing w:before="240" w:after="80"/>
+        <w:ind w:firstLine="0"/>
+        <w:jc w:val="both"/>
       </w:pPr>
       <w:r>
         <w:rPr>
           <w:rFonts w:ascii="Times New Roman" w:hAnsi="Times New Roman"/>
-          <w:sz w:val="22"/>
+          <w:b w:val="0"/>
+          <w:sz w:val="24"/>
         </w:rPr>
-        <w:t>Документы, подтверждающие спорность требования: квитанции оплат, переписка, договор, выписки, заявления, иное.</w:t>
       </w:r>
     </w:p>
     <w:p>
       <w:pPr>
-        <w:pStyle w:val="ListBullet"/>
+        <w:spacing w:before="0" w:after="0"/>
+        <w:ind w:firstLine="0"/>
+        <w:jc w:val="left"/>
       </w:pPr>
       <w:r>
         <w:rPr>
           <w:rFonts w:ascii="Times New Roman" w:hAnsi="Times New Roman"/>
-          <w:sz w:val="22"/>
+          <w:sz w:val="24"/>
         </w:rPr>
-        <w:t>Доверенность представителя - если подает представитель.</w:t>
+        <w:t>Дата: «___» ____________ 20___ г.          Подпись: _________________________ /</w:t>
       </w:r>
-    </w:p>
-    <w:p>
       <w:r>
         <w:rPr>
           <w:rFonts w:ascii="Times New Roman" w:hAnsi="Times New Roman"/>
-          <w:b w:val="0"/>
-          <w:sz w:val="22"/>
+          <w:b/>
+          <w:sz w:val="24"/>
         </w:rPr>
-        <w:t>Примечание: если нотариус не принимает возражение, прекратил деятельность либо невозможно установить его действующий адрес, используйте отдельный шаблон жалобы в суд об отмене исполнительной надписи.</w:t>
+        <w:t>[ФИО должника]</w:t>
+      </w:r>
+      <w:r>
+        <w:rPr>
+          <w:rFonts w:ascii="Times New Roman" w:hAnsi="Times New Roman"/>
+          <w:sz w:val="24"/>
+        </w:rPr>
+        <w:t>/</w:t>
       </w:r>
     </w:p>
-    <w:p/>
-    <w:tbl>
-      <w:tblPr>
-        <w:tblW w:type="auto" w:w="0"/>
-        <w:tblLook w:firstColumn="1" w:firstRow="1" w:lastColumn="0" w:lastRow="0" w:noHBand="0" w:noVBand="1" w:val="04A0"/>
-        <w:tblBorders>
-          <w:top w:val="single" w:sz="4" w:space="0" w:color="BFBFBF"/>
-          <w:left w:val="single" w:sz="4" w:space="0" w:color="BFBFBF"/>
-          <w:bottom w:val="single" w:sz="4" w:space="0" w:color="BFBFBF"/>
-          <w:right w:val="single" w:sz="4" w:space="0" w:color="BFBFBF"/>
-          <w:insideH w:val="single" w:sz="4" w:space="0" w:color="BFBFBF"/>
-          <w:insideV w:val="single" w:sz="4" w:space="0" w:color="BFBFBF"/>
-        </w:tblBorders>
-      </w:tblPr>
-      <w:tblGrid>
-        <w:gridCol w:w="3419"/>
-        <w:gridCol w:w="3419"/>
-        <w:gridCol w:w="3419"/>
-      </w:tblGrid>
-      <w:tr>
-        <w:tc>
-          <w:tcPr>
-            <w:tcW w:type="dxa" w:w="2835"/>
-            <w:shd w:fill="F2F2F2"/>
-          </w:tcPr>
-          <w:p>
-            <w:r/>
-            <w:r>
-              <w:rPr>
-                <w:rFonts w:ascii="Times New Roman" w:hAnsi="Times New Roman"/>
-                <w:b/>
-                <w:sz w:val="22"/>
-              </w:rPr>
-              <w:t>Дата</w:t>
-            </w:r>
-          </w:p>
-        </w:tc>
-        <w:tc>
-          <w:tcPr>
-            <w:tcW w:type="dxa" w:w="2835"/>
-            <w:shd w:fill="F2F2F2"/>
-          </w:tcPr>
-          <w:p>
-            <w:r/>
-            <w:r>
-              <w:rPr>
-                <w:rFonts w:ascii="Times New Roman" w:hAnsi="Times New Roman"/>
-                <w:b/>
-                <w:sz w:val="22"/>
-              </w:rPr>
-              <w:t>Подпись</w:t>
-            </w:r>
-          </w:p>
-        </w:tc>
-        <w:tc>
-          <w:tcPr>
-            <w:tcW w:type="dxa" w:w="2835"/>
-            <w:shd w:fill="F2F2F2"/>
-          </w:tcPr>
-          <w:p>
-            <w:r/>
-            <w:r>
-              <w:rPr>
-                <w:rFonts w:ascii="Times New Roman" w:hAnsi="Times New Roman"/>
-                <w:b/>
-                <w:sz w:val="22"/>
-              </w:rPr>
-              <w:t>ФИО</w:t>
-            </w:r>
-          </w:p>
-        </w:tc>
-      </w:tr>
-      <w:tr>
-        <w:tc>
-          <w:tcPr>
-            <w:tcW w:type="dxa" w:w="2835"/>
-          </w:tcPr>
-          <w:p>
-            <w:r/>
-            <w:r>
-              <w:rPr>
-                <w:rFonts w:ascii="Times New Roman" w:hAnsi="Times New Roman"/>
-                <w:b w:val="0"/>
-                <w:sz w:val="22"/>
-              </w:rPr>
-              <w:t>«___» __________ 20___ г.</w:t>
-            </w:r>
-          </w:p>
-        </w:tc>
-        <w:tc>
-          <w:tcPr>
-            <w:tcW w:type="dxa" w:w="2835"/>
-          </w:tcPr>
-          <w:p>
-            <w:r/>
-            <w:r>
-              <w:rPr>
-                <w:rFonts w:ascii="Times New Roman" w:hAnsi="Times New Roman"/>
-                <w:b w:val="0"/>
-                <w:sz w:val="22"/>
-              </w:rPr>
-              <w:t>__________________</w:t>
-            </w:r>
-          </w:p>
-        </w:tc>
-        <w:tc>
-          <w:tcPr>
-            <w:tcW w:type="dxa" w:w="2835"/>
-          </w:tcPr>
-          <w:p>
-            <w:r/>
-            <w:r>
-              <w:rPr>
-                <w:rFonts w:ascii="Times New Roman" w:hAnsi="Times New Roman"/>
-                <w:b w:val="0"/>
-                <w:sz w:val="22"/>
-              </w:rPr>
-              <w:t>[ФИО заявителя]</w:t>
-            </w:r>
-          </w:p>
-        </w:tc>
-      </w:tr>
-    </w:tbl>
     <w:sectPr>
-      <w:headerReference w:type="default" r:id="rId9"/>
-      <w:footerReference w:type="default" r:id="rId10"/>
       <w:pgSz w:w="12240" w:h="15840"/>
-      <w:pgMar w:top="964" w:right="850" w:bottom="907" w:left="1134" w:header="720" w:footer="720" w:gutter="0"/>
+      <w:pgMar w:top="1134" w:right="850" w:bottom="1134" w:left="1701" w:header="720" w:footer="720" w:gutter="0"/>
       <w:cols w:space="720"/>
       <w:docGrid w:linePitch="360"/>
     </w:sectPr>
   </w:body>
 </w:document>
-</file>
-
-<file path=word/footer1.xml><?xml version="1.0" encoding="utf-8"?>
-<w:ftr xmlns:m="http://schemas.openxmlformats.org/officeDocument/2006/math" xmlns:mc="http://schemas.openxmlformats.org/markup-compatibility/2006" xmlns:mo="http://schemas.microsoft.com/office/mac/office/2008/main" xmlns:mv="urn:schemas-microsoft-com:mac:vml" xmlns:o="urn:schemas-microsoft-com:office:office" xmlns:r="http://schemas.openxmlformats.org/officeDocument/2006/relationships" xmlns:v="urn:schemas-microsoft-com:vml" xmlns:w10="urn:schemas-microsoft-com:office:word" xmlns:w14="http://schemas.microsoft.com/office/word/2010/wordml" xmlns:w="http://schemas.openxmlformats.org/wordprocessingml/2006/main" xmlns:wne="http://schemas.microsoft.com/office/word/2006/wordml" xmlns:wp14="http://schemas.microsoft.com/office/word/2010/wordprocessingDrawing" xmlns:wp="http://schemas.openxmlformats.org/drawingml/2006/wordprocessingDrawing" xmlns:wpc="http://schemas.microsoft.com/office/word/2010/wordprocessingCanvas" xmlns:wpg="http://schemas.microsoft.com/office/word/2010/wordprocessingGroup" xmlns:wpi="http://schemas.microsoft.com/office/word/2010/wordprocessingInk" xmlns:wps="http://schemas.microsoft.com/office/word/2010/wordprocessingShape" mc:Ignorable="w14 wp14">
-  <w:p>
-    <w:pPr>
-      <w:pStyle w:val="Footer"/>
-      <w:jc w:val="center"/>
-    </w:pPr>
-    <w:r>
-      <w:rPr>
-        <w:rFonts w:ascii="Times New Roman" w:hAnsi="Times New Roman"/>
-        <w:color w:val="646464"/>
-        <w:sz w:val="16"/>
-      </w:rPr>
-      <w:t>Шаблон для самостоятельного заполнения. Сложные случаи лучше проверить с юристом до подачи.</w:t>
-    </w:r>
-  </w:p>
-</w:ftr>
-</file>
-
-<file path=word/header1.xml><?xml version="1.0" encoding="utf-8"?>
-<w:hdr xmlns:m="http://schemas.openxmlformats.org/officeDocument/2006/math" xmlns:mc="http://schemas.openxmlformats.org/markup-compatibility/2006" xmlns:mo="http://schemas.microsoft.com/office/mac/office/2008/main" xmlns:mv="urn:schemas-microsoft-com:mac:vml" xmlns:o="urn:schemas-microsoft-com:office:office" xmlns:r="http://schemas.openxmlformats.org/officeDocument/2006/relationships" xmlns:v="urn:schemas-microsoft-com:vml" xmlns:w10="urn:schemas-microsoft-com:office:word" xmlns:w14="http://schemas.microsoft.com/office/word/2010/wordml" xmlns:w="http://schemas.openxmlformats.org/wordprocessingml/2006/main" xmlns:wne="http://schemas.microsoft.com/office/word/2006/wordml" xmlns:wp14="http://schemas.microsoft.com/office/word/2010/wordprocessingDrawing" xmlns:wp="http://schemas.openxmlformats.org/drawingml/2006/wordprocessingDrawing" xmlns:wpc="http://schemas.microsoft.com/office/word/2010/wordprocessingCanvas" xmlns:wpg="http://schemas.microsoft.com/office/word/2010/wordprocessingGroup" xmlns:wpi="http://schemas.microsoft.com/office/word/2010/wordprocessingInk" xmlns:wps="http://schemas.microsoft.com/office/word/2010/wordprocessingShape" mc:Ignorable="w14 wp14">
-  <w:p>
-    <w:pPr>
-      <w:pStyle w:val="Header"/>
-      <w:jc w:val="right"/>
-    </w:pPr>
-    <w:r>
-      <w:rPr>
-        <w:rFonts w:ascii="Times New Roman" w:hAnsi="Times New Roman"/>
-        <w:color w:val="646464"/>
-        <w:sz w:val="16"/>
-      </w:rPr>
-      <w:t>ZakonExpert.kz | Версия шаблонов: 19.06.2026</w:t>
-    </w:r>
-  </w:p>
-</w:hdr>
 </file>
 
 <file path=word/numbering.xml><?xml version="1.0" encoding="utf-8"?>
@@ -881,10 +834,6 @@
     <w:name w:val="Normal"/>
     <w:qFormat/>
     <w:rsid w:val="00FC693F"/>
-    <w:rPr>
-      <w:rFonts w:ascii="Times New Roman" w:hAnsi="Times New Roman" w:eastAsia="Times New Roman"/>
-      <w:sz w:val="22"/>
-    </w:rPr>
   </w:style>
   <w:style w:type="paragraph" w:styleId="Header">
     <w:name w:val="header"/>
@@ -945,7 +894,7 @@
       <w:outlineLvl w:val="0"/>
     </w:pPr>
     <w:rPr>
-      <w:rFonts w:asciiTheme="majorHAnsi" w:eastAsiaTheme="majorEastAsia" w:hAnsiTheme="majorHAnsi" w:cstheme="majorBidi" w:ascii="Times New Roman" w:hAnsi="Times New Roman" w:eastAsia="Times New Roman"/>
+      <w:rFonts w:asciiTheme="majorHAnsi" w:eastAsiaTheme="majorEastAsia" w:hAnsiTheme="majorHAnsi" w:cstheme="majorBidi"/>
       <w:b/>
       <w:bCs/>
       <w:color w:val="365F91" w:themeColor="accent1" w:themeShade="BF"/>
@@ -969,11 +918,11 @@
       <w:outlineLvl w:val="1"/>
     </w:pPr>
     <w:rPr>
-      <w:rFonts w:asciiTheme="majorHAnsi" w:eastAsiaTheme="majorEastAsia" w:hAnsiTheme="majorHAnsi" w:cstheme="majorBidi" w:ascii="Times New Roman" w:hAnsi="Times New Roman" w:eastAsia="Times New Roman"/>
+      <w:rFonts w:asciiTheme="majorHAnsi" w:eastAsiaTheme="majorEastAsia" w:hAnsiTheme="majorHAnsi" w:cstheme="majorBidi"/>
       <w:b/>
       <w:bCs/>
       <w:color w:val="4F81BD" w:themeColor="accent1"/>
-      <w:sz w:val="24"/>
+      <w:sz w:val="26"/>
       <w:szCs w:val="26"/>
     </w:rPr>
   </w:style>
@@ -993,11 +942,10 @@
       <w:outlineLvl w:val="2"/>
     </w:pPr>
     <w:rPr>
-      <w:rFonts w:asciiTheme="majorHAnsi" w:eastAsiaTheme="majorEastAsia" w:hAnsiTheme="majorHAnsi" w:cstheme="majorBidi" w:ascii="Times New Roman" w:hAnsi="Times New Roman" w:eastAsia="Times New Roman"/>
+      <w:rFonts w:asciiTheme="majorHAnsi" w:eastAsiaTheme="majorEastAsia" w:hAnsiTheme="majorHAnsi" w:cstheme="majorBidi"/>
       <w:b/>
       <w:bCs/>
       <w:color w:val="4F81BD" w:themeColor="accent1"/>
-      <w:sz w:val="22"/>
     </w:rPr>
   </w:style>
   <w:style w:type="paragraph" w:styleId="Heading4">
@@ -1235,12 +1183,11 @@
       <w:contextualSpacing/>
     </w:pPr>
     <w:rPr>
-      <w:rFonts w:asciiTheme="majorHAnsi" w:eastAsiaTheme="majorEastAsia" w:hAnsiTheme="majorHAnsi" w:cstheme="majorBidi" w:ascii="Times New Roman" w:hAnsi="Times New Roman" w:eastAsia="Times New Roman"/>
-      <w:b/>
+      <w:rFonts w:asciiTheme="majorHAnsi" w:eastAsiaTheme="majorEastAsia" w:hAnsiTheme="majorHAnsi" w:cstheme="majorBidi"/>
       <w:color w:val="17365D" w:themeColor="text2" w:themeShade="BF"/>
       <w:spacing w:val="5"/>
       <w:kern w:val="28"/>
-      <w:sz w:val="30"/>
+      <w:sz w:val="52"/>
       <w:szCs w:val="52"/>
     </w:rPr>
   </w:style>

</xml_diff>